<commit_message>
Apply Brian's decisions to the NSF biosketch worksheet
- Position title "Assistant Professor of Medical Physics" for all four
  NSF documents
- Ph.D. completion 05/2021; field "Medical Physics" for S.M.S. and Ph.D.
- Department names and AAPM location confirmed; CONFIRM tags dropped
- AAPM committee memberships (QUANTEC 2, Machine Intelligence, TG-263,
  Board of Associate Editors) go to Synergistic Activities; TG-263 is
  "Present"
- Keras product B5 cites the merged PR: only reconstruct_patches was
  merged, and no tagged release contains it as of 27 Oct 2026
- Split resolved items from the remaining open items

Co-Authored-By: Claude Opus 5.5 <noreply@anthropic.com>
</commit_message>
<xml_diff>
--- a/Clincal_CV/NSF/1_Biosketch/NSF_Biosketch_SciENcv_Worksheet.docx
+++ b/Clincal_CV/NSF/1_Biosketch/NSF_Biosketch_SciENcv_Worksheet.docx
@@ -18,6 +18,20 @@
     </w:p>
     <w:p>
       <w:pPr>
+        <w:spacing w:after="40" w:before="0"/>
+      </w:pPr>
+      <w:r>
+        <w:rPr>
+          <w:rFonts w:ascii="Times New Roman" w:hAnsi="Times New Roman" w:eastAsia="Times New Roman" w:cs="Times New Roman"/>
+          <w:b w:val="0"/>
+          <w:i/>
+          <w:sz w:val="22"/>
+        </w:rPr>
+        <w:t>Brian Mark Anderson, PhD, DABR · University of California, San Diego · prepared 27 October 2026</w:t>
+      </w:r>
+    </w:p>
+    <w:p>
+      <w:pPr>
         <w:spacing w:after="200" w:before="0"/>
       </w:pPr>
       <w:r>
@@ -27,7 +41,7 @@
           <w:i/>
           <w:sz w:val="22"/>
         </w:rPr>
-        <w:t>Brian Mark Anderson, PhD, DABR · University of California, San Diego · prepared 27 October 2026</w:t>
+        <w:t>Revision 2, 27 Oct 2026: Brian’s decisions on the first draft’s open items are applied in sections 1–4 and recorded in section 6.</w:t>
       </w:r>
     </w:p>
     <w:p>
@@ -420,17 +434,7 @@
                 <w:i w:val="0"/>
                 <w:sz w:val="22"/>
               </w:rPr>
-              <w:t xml:space="preserve">Clinical Assistant Professor of Medical Physics </w:t>
-            </w:r>
-            <w:r>
-              <w:rPr>
-                <w:rFonts w:ascii="Times New Roman" w:hAnsi="Times New Roman" w:eastAsia="Times New Roman" w:cs="Times New Roman"/>
-                <w:b/>
-                <w:i w:val="0"/>
-                <w:sz w:val="22"/>
-                <w:highlight w:val="yellow"/>
-              </w:rPr>
-              <w:t>[CONFIRM wording]</w:t>
+              <w:t>Assistant Professor of Medical Physics</w:t>
             </w:r>
           </w:p>
         </w:tc>
@@ -450,7 +454,7 @@
                 <w:i w:val="0"/>
                 <w:sz w:val="22"/>
               </w:rPr>
-              <w:t>CV header and NIH biosketch say “Clinical Assistant Professor”; the SciENcv biosketch certified 02/2026 says “Assistant Professor, Medical Physics”.</w:t>
+              <w:t>Brian’s choice (27 Oct 2026). The CV header says “Clinical Assistant Professor of Medical Physics”; the SciENcv biosketch certified 02/2026 said “Assistant Professor, Medical Physics”.</w:t>
             </w:r>
           </w:p>
           <w:p>
@@ -464,7 +468,7 @@
                 <w:i w:val="0"/>
                 <w:sz w:val="22"/>
               </w:rPr>
-              <w:t>Pick one wording and use it in all four NSF documents (biosketch, Current &amp; Pending, COA, Synergistic Activities).</w:t>
+              <w:t>Use this wording in all four NSF documents (biosketch, Current &amp; Pending, COA, Synergistic Activities).</w:t>
             </w:r>
           </w:p>
         </w:tc>
@@ -866,17 +870,7 @@
                 <w:i w:val="0"/>
                 <w:sz w:val="22"/>
               </w:rPr>
-              <w:t xml:space="preserve">Residency, Medical Physics (no degree; the 02/2026 SciENcv entry used “Resident”) </w:t>
-            </w:r>
-            <w:r>
-              <w:rPr>
-                <w:rFonts w:ascii="Times New Roman" w:hAnsi="Times New Roman" w:eastAsia="Times New Roman" w:cs="Times New Roman"/>
-                <w:b/>
-                <w:i w:val="0"/>
-                <w:sz w:val="22"/>
-                <w:highlight w:val="yellow"/>
-              </w:rPr>
-              <w:t>[CONFIRM entry type offered by the SciENcv drop-down]</w:t>
+              <w:t>Residency, Medical Physics (no degree; the 02/2026 SciENcv entry used “Resident”; pick the closest option the SciENcv drop-down offers)</w:t>
             </w:r>
           </w:p>
         </w:tc>
@@ -1085,17 +1079,7 @@
                 <w:i w:val="0"/>
                 <w:sz w:val="22"/>
               </w:rPr>
-              <w:t xml:space="preserve">06/2021 </w:t>
-            </w:r>
-            <w:r>
-              <w:rPr>
-                <w:rFonts w:ascii="Times New Roman" w:hAnsi="Times New Roman" w:eastAsia="Times New Roman" w:cs="Times New Roman"/>
-                <w:b/>
-                <w:i w:val="0"/>
-                <w:sz w:val="22"/>
-                <w:highlight w:val="yellow"/>
-              </w:rPr>
-              <w:t>[CONFIRM: NIH biosketch table says 5/2021; SciENcv 02/2026 says 06/2021]</w:t>
+              <w:t>05/2021</w:t>
             </w:r>
           </w:p>
         </w:tc>
@@ -1115,17 +1099,7 @@
                 <w:i w:val="0"/>
                 <w:sz w:val="22"/>
               </w:rPr>
-              <w:t xml:space="preserve">Medical Physics </w:t>
-            </w:r>
-            <w:r>
-              <w:rPr>
-                <w:rFonts w:ascii="Times New Roman" w:hAnsi="Times New Roman" w:eastAsia="Times New Roman" w:cs="Times New Roman"/>
-                <w:b/>
-                <w:i w:val="0"/>
-                <w:sz w:val="22"/>
-                <w:highlight w:val="yellow"/>
-              </w:rPr>
-              <w:t>[CONFIRM: NIH biosketch table lists “Diagnostic Imaging Medical Physics” for the Ph.D. row]</w:t>
+              <w:t>Medical Physics</w:t>
             </w:r>
           </w:p>
         </w:tc>
@@ -1145,7 +1119,21 @@
                 <w:i w:val="0"/>
                 <w:sz w:val="22"/>
               </w:rPr>
-              <w:t>CV Education: 2017 – 2021 Ph.D., Medical Physics, MD Anderson.</w:t>
+              <w:t>CV Education: 2017 – 2021 Ph.D., Medical Physics, MD Anderson; NIH biosketch table 5/2021.</w:t>
+            </w:r>
+          </w:p>
+          <w:p>
+            <w:pPr>
+              <w:spacing w:after="40"/>
+            </w:pPr>
+            <w:r>
+              <w:rPr>
+                <w:rFonts w:ascii="Times New Roman" w:hAnsi="Times New Roman" w:eastAsia="Times New Roman" w:cs="Times New Roman"/>
+                <w:b w:val="0"/>
+                <w:i w:val="0"/>
+                <w:sz w:val="22"/>
+              </w:rPr>
+              <w:t>Brian confirmed 05/2021 and plain “Medical Physics” (27 Oct 2026). The SciENcv profile from 02/2026 shows 06/2021: correct it there.</w:t>
             </w:r>
           </w:p>
           <w:p>
@@ -1284,17 +1272,7 @@
                 <w:i w:val="0"/>
                 <w:sz w:val="22"/>
               </w:rPr>
-              <w:t xml:space="preserve">Medical Physics </w:t>
-            </w:r>
-            <w:r>
-              <w:rPr>
-                <w:rFonts w:ascii="Times New Roman" w:hAnsi="Times New Roman" w:eastAsia="Times New Roman" w:cs="Times New Roman"/>
-                <w:b/>
-                <w:i w:val="0"/>
-                <w:sz w:val="22"/>
-                <w:highlight w:val="yellow"/>
-              </w:rPr>
-              <w:t>[CONFIRM: NIH biosketch table lists “Therapeutic Medical Physics” for the S.M.S. row]</w:t>
+              <w:t>Medical Physics</w:t>
             </w:r>
           </w:p>
         </w:tc>
@@ -1315,6 +1293,20 @@
                 <w:sz w:val="22"/>
               </w:rPr>
               <w:t>CV Education: 2015 – 2017 S.M.S, Medical Physics, MD Anderson; NIH biosketch table 7/2017.</w:t>
+            </w:r>
+          </w:p>
+          <w:p>
+            <w:pPr>
+              <w:spacing w:after="40"/>
+            </w:pPr>
+            <w:r>
+              <w:rPr>
+                <w:rFonts w:ascii="Times New Roman" w:hAnsi="Times New Roman" w:eastAsia="Times New Roman" w:cs="Times New Roman"/>
+                <w:b w:val="0"/>
+                <w:i w:val="0"/>
+                <w:sz w:val="22"/>
+              </w:rPr>
+              <w:t>Brian confirmed plain “Medical Physics” (27 Oct 2026); the NIH table’s “Therapeutic Medical Physics” is not used.</w:t>
             </w:r>
           </w:p>
         </w:tc>
@@ -1779,7 +1771,7 @@
                 <w:i w:val="0"/>
                 <w:sz w:val="22"/>
               </w:rPr>
-              <w:t>Clinical Assistant Professor (of Medical Physics)</w:t>
+              <w:t>Assistant Professor of Medical Physics</w:t>
             </w:r>
           </w:p>
         </w:tc>
@@ -1859,7 +1851,7 @@
                 <w:i w:val="0"/>
                 <w:sz w:val="22"/>
               </w:rPr>
-              <w:t>CV header; NIH biosketch Positions and Employment.</w:t>
+              <w:t>CV header; NIH biosketch Positions and Employment. Title wording per Brian (27 Oct 2026), matching the position title in section 1.</w:t>
             </w:r>
           </w:p>
           <w:p>
@@ -1978,17 +1970,7 @@
                 <w:i w:val="0"/>
                 <w:sz w:val="22"/>
               </w:rPr>
-              <w:t xml:space="preserve">Department of Radiation Oncology </w:t>
-            </w:r>
-            <w:r>
-              <w:rPr>
-                <w:rFonts w:ascii="Times New Roman" w:hAnsi="Times New Roman" w:eastAsia="Times New Roman" w:cs="Times New Roman"/>
-                <w:b/>
-                <w:i w:val="0"/>
-                <w:sz w:val="22"/>
-                <w:highlight w:val="yellow"/>
-              </w:rPr>
-              <w:t>[CONFIRM department]</w:t>
+              <w:t>Department of Radiation Oncology</w:t>
             </w:r>
           </w:p>
         </w:tc>
@@ -2457,17 +2439,7 @@
                 <w:i w:val="0"/>
                 <w:sz w:val="22"/>
               </w:rPr>
-              <w:t xml:space="preserve">Alexandria, Virginia, United States </w:t>
-            </w:r>
-            <w:r>
-              <w:rPr>
-                <w:rFonts w:ascii="Times New Roman" w:hAnsi="Times New Roman" w:eastAsia="Times New Roman" w:cs="Times New Roman"/>
-                <w:b/>
-                <w:i w:val="0"/>
-                <w:sz w:val="22"/>
-                <w:highlight w:val="yellow"/>
-              </w:rPr>
-              <w:t>[CONFIRM location: AAPM headquarters]</w:t>
+              <w:t>Alexandria, Virginia, United States (AAPM headquarters)</w:t>
             </w:r>
           </w:p>
         </w:tc>
@@ -2819,17 +2791,7 @@
                 <w:i w:val="0"/>
                 <w:sz w:val="22"/>
               </w:rPr>
-              <w:t xml:space="preserve">Also appears under Professional Preparation. The 02/2026 SciENcv biosketch listed it only there; listing it in both places is allowed. </w:t>
-            </w:r>
-            <w:r>
-              <w:rPr>
-                <w:rFonts w:ascii="Times New Roman" w:hAnsi="Times New Roman" w:eastAsia="Times New Roman" w:cs="Times New Roman"/>
-                <w:b/>
-                <w:i w:val="0"/>
-                <w:sz w:val="22"/>
-                <w:highlight w:val="yellow"/>
-              </w:rPr>
-              <w:t>[CONFIRM keep here]</w:t>
+              <w:t>Also appears under Professional Preparation. The 02/2026 SciENcv biosketch listed it only there; listing it in both places is allowed. Kept here as a titled training position.</w:t>
             </w:r>
           </w:p>
         </w:tc>
@@ -2934,17 +2896,7 @@
                 <w:i w:val="0"/>
                 <w:sz w:val="22"/>
               </w:rPr>
-              <w:t xml:space="preserve">Department of Imaging Physics </w:t>
-            </w:r>
-            <w:r>
-              <w:rPr>
-                <w:rFonts w:ascii="Times New Roman" w:hAnsi="Times New Roman" w:eastAsia="Times New Roman" w:cs="Times New Roman"/>
-                <w:b/>
-                <w:i w:val="0"/>
-                <w:sz w:val="22"/>
-                <w:highlight w:val="yellow"/>
-              </w:rPr>
-              <w:t>[CONFIRM department]</w:t>
+              <w:t>Department of Imaging Physics</w:t>
             </w:r>
           </w:p>
         </w:tc>
@@ -3089,17 +3041,7 @@
                 <w:i w:val="0"/>
                 <w:sz w:val="22"/>
               </w:rPr>
-              <w:t xml:space="preserve">Radiation Oncology </w:t>
-            </w:r>
-            <w:r>
-              <w:rPr>
-                <w:rFonts w:ascii="Times New Roman" w:hAnsi="Times New Roman" w:eastAsia="Times New Roman" w:cs="Times New Roman"/>
-                <w:b/>
-                <w:i w:val="0"/>
-                <w:sz w:val="22"/>
-                <w:highlight w:val="yellow"/>
-              </w:rPr>
-              <w:t>[CONFIRM department]</w:t>
+              <w:t>Radiation Oncology</w:t>
             </w:r>
           </w:p>
         </w:tc>
@@ -3244,17 +3186,7 @@
                 <w:i w:val="0"/>
                 <w:sz w:val="22"/>
               </w:rPr>
-              <w:t xml:space="preserve">Nuclear and Radiological Engineering </w:t>
-            </w:r>
-            <w:r>
-              <w:rPr>
-                <w:rFonts w:ascii="Times New Roman" w:hAnsi="Times New Roman" w:eastAsia="Times New Roman" w:cs="Times New Roman"/>
-                <w:b/>
-                <w:i w:val="0"/>
-                <w:sz w:val="22"/>
-                <w:highlight w:val="yellow"/>
-              </w:rPr>
-              <w:t>[CONFIRM department]</w:t>
+              <w:t>Nuclear and Radiological Engineering</w:t>
             </w:r>
           </w:p>
         </w:tc>
@@ -3332,7 +3264,7 @@
           <w:i w:val="0"/>
           <w:sz w:val="22"/>
         </w:rPr>
-        <w:t>NSF counts titled positions; plain committee memberships and society memberships are normally left out of this section and described in Synergistic Activities instead.</w:t>
+        <w:t>NSF counts titled positions. Brian decided on 27 Oct 2026 that his committee memberships go in the Synergistic Activities document, not here; the two remaining optional titled roles are his call.</w:t>
       </w:r>
     </w:p>
     <w:tbl>
@@ -3562,7 +3494,7 @@
                 <w:i w:val="0"/>
                 <w:sz w:val="22"/>
               </w:rPr>
-              <w:t>Omit: internal committee duty, not a titled appointment. Better suited to Synergistic Activities if at all.</w:t>
+              <w:t>Omit: internal committee duty, not a titled appointment.</w:t>
             </w:r>
           </w:p>
         </w:tc>
@@ -3667,17 +3599,7 @@
                 <w:i w:val="0"/>
                 <w:sz w:val="22"/>
               </w:rPr>
-              <w:t xml:space="preserve">Brian’s call. Committee memberships are usually not listed as appointments; they fit Synergistic Activities. </w:t>
-            </w:r>
-            <w:r>
-              <w:rPr>
-                <w:rFonts w:ascii="Times New Roman" w:hAnsi="Times New Roman" w:eastAsia="Times New Roman" w:cs="Times New Roman"/>
-                <w:b/>
-                <w:i w:val="0"/>
-                <w:sz w:val="22"/>
-                <w:highlight w:val="yellow"/>
-              </w:rPr>
-              <w:t>[CONFIRM]</w:t>
+              <w:t>Omit here; list under Synergistic Activities (Brian, 27 Oct 2026).</w:t>
             </w:r>
           </w:p>
         </w:tc>
@@ -3782,17 +3704,7 @@
                 <w:i w:val="0"/>
                 <w:sz w:val="22"/>
               </w:rPr>
-              <w:t xml:space="preserve">Same as above. </w:t>
-            </w:r>
-            <w:r>
-              <w:rPr>
-                <w:rFonts w:ascii="Times New Roman" w:hAnsi="Times New Roman" w:eastAsia="Times New Roman" w:cs="Times New Roman"/>
-                <w:b/>
-                <w:i w:val="0"/>
-                <w:sz w:val="22"/>
-                <w:highlight w:val="yellow"/>
-              </w:rPr>
-              <w:t>[CONFIRM]</w:t>
+              <w:t>Omit here; list under Synergistic Activities (Brian, 27 Oct 2026).</w:t>
             </w:r>
           </w:p>
         </w:tc>
@@ -3897,7 +3809,7 @@
                 <w:i w:val="0"/>
                 <w:sz w:val="22"/>
               </w:rPr>
-              <w:t>Redundant with the Associate Editor appointment already listed; omit.</w:t>
+              <w:t>Omit here (redundant with the Associate Editor appointment in 3a); may be mentioned under Synergistic Activities.</w:t>
             </w:r>
           </w:p>
         </w:tc>
@@ -4002,17 +3914,7 @@
                 <w:i w:val="0"/>
                 <w:sz w:val="22"/>
               </w:rPr>
-              <w:t xml:space="preserve">Same as above. Note the CV gives 2021 – Present in Professional Service but 2021–2025 under Major Contributions. </w:t>
-            </w:r>
-            <w:r>
-              <w:rPr>
-                <w:rFonts w:ascii="Times New Roman" w:hAnsi="Times New Roman" w:eastAsia="Times New Roman" w:cs="Times New Roman"/>
-                <w:b/>
-                <w:i w:val="0"/>
-                <w:sz w:val="22"/>
-                <w:highlight w:val="yellow"/>
-              </w:rPr>
-              <w:t>[CONFIRM end date]</w:t>
+              <w:t>Omit here; list under Synergistic Activities (Brian, 27 Oct 2026). End date is “Present”; the CV’s Major Contributions entry (2021–2025) is being corrected in a separate session.</w:t>
             </w:r>
           </w:p>
         </w:tc>
@@ -4117,17 +4019,7 @@
                 <w:i w:val="0"/>
                 <w:sz w:val="22"/>
               </w:rPr>
-              <w:t xml:space="preserve">Titled role (CV Clinical Projects). Optional; the 02/2026 SciENcv omitted it. </w:t>
-            </w:r>
-            <w:r>
-              <w:rPr>
-                <w:rFonts w:ascii="Times New Roman" w:hAnsi="Times New Roman" w:eastAsia="Times New Roman" w:cs="Times New Roman"/>
-                <w:b/>
-                <w:i w:val="0"/>
-                <w:sz w:val="22"/>
-                <w:highlight w:val="yellow"/>
-              </w:rPr>
-              <w:t>[CONFIRM]</w:t>
+              <w:t>Optional titled role (CV Clinical Projects); the 02/2026 SciENcv omitted it. Add to 3a only if Brian wants it listed.</w:t>
             </w:r>
           </w:p>
         </w:tc>
@@ -4232,17 +4124,7 @@
                 <w:i w:val="0"/>
                 <w:sz w:val="22"/>
               </w:rPr>
-              <w:t xml:space="preserve">Titled editorial role (CV Professional Service). Optional. </w:t>
-            </w:r>
-            <w:r>
-              <w:rPr>
-                <w:rFonts w:ascii="Times New Roman" w:hAnsi="Times New Roman" w:eastAsia="Times New Roman" w:cs="Times New Roman"/>
-                <w:b/>
-                <w:i w:val="0"/>
-                <w:sz w:val="22"/>
-                <w:highlight w:val="yellow"/>
-              </w:rPr>
-              <w:t>[CONFIRM]</w:t>
+              <w:t>Optional titled editorial role (CV Professional Service). Add to 3a only if Brian wants it listed.</w:t>
             </w:r>
           </w:p>
         </w:tc>
@@ -4490,7 +4372,7 @@
           <w:i w:val="0"/>
           <w:sz w:val="22"/>
         </w:rPr>
-        <w:t xml:space="preserve">Assumption. </w:t>
+        <w:t xml:space="preserve">Scope. </w:t>
       </w:r>
       <w:r>
         <w:rPr>
@@ -4499,7 +4381,7 @@
           <w:i w:val="0"/>
           <w:sz w:val="22"/>
         </w:rPr>
-        <w:t>The proposal topic was not known when this worksheet was prepared. The split below assumes a proposal on AI / deep learning for radiation oncology (auto-segmentation, deformable registration, clinical software and data infrastructure). If the proposal is about something else, swap items between 4a, 4b and the bench list in 4c. NSF allows up to five products in each list; only these ten are used in review.</w:t>
+        <w:t>The split below was drawn up for a proposal on AI / deep learning for radiation oncology (auto-segmentation, deformable registration, clinical software and data infrastructure), and Brian confirmed it on 27 Oct 2026. If a later proposal is about something else, swap items between 4a, 4b and the bench list in 4c. NSF allows up to five products in each list; only these ten are used in review.</w:t>
       </w:r>
     </w:p>
     <w:p>
@@ -6420,7 +6302,7 @@
                 <w:i w:val="0"/>
                 <w:sz w:val="22"/>
               </w:rPr>
-              <w:t>reconstruct_patches operation and ReconstructPatches2D / ReconstructPatches3D layers for Keras 3: the inverse of extract_patches, reassembling patch-wise model predictions into full-resolution images and volumes (software contribution)</w:t>
+              <w:t>keras.ops.image.reconstruct_patches for Keras 3: the inverse of extract_patches, reassembling non-overlapping 2D or 3D patches of model predictions into full-resolution images and volumes (software contribution)</w:t>
             </w:r>
           </w:p>
         </w:tc>
@@ -6440,7 +6322,7 @@
                 <w:i w:val="0"/>
                 <w:sz w:val="22"/>
               </w:rPr>
-              <w:t>keras-team/keras (GitHub), pull request #22984, merged 16 July 2026; follow-ups #23267 (merged 20 July 2026) and #23319 (merged 4 September 2026)</w:t>
+              <w:t>keras-team/keras (GitHub), merged to master via pull request #22984 on 16 July 2026; follow-ups #23267 (channels_first support, 20 July 2026) and #23319 (output_size auto-inference, 4 September 2026)</w:t>
             </w:r>
           </w:p>
         </w:tc>
@@ -6460,7 +6342,7 @@
                 <w:i w:val="0"/>
                 <w:sz w:val="22"/>
               </w:rPr>
-              <w:t>07/2026</w:t>
+              <w:t>07/2026 (merged); in no tagged release as of 27 Oct 2026</w:t>
             </w:r>
           </w:p>
         </w:tc>
@@ -6500,7 +6382,7 @@
                 <w:i w:val="0"/>
                 <w:sz w:val="22"/>
               </w:rPr>
-              <w:t>CV Major Contributions. Enter manually (non-journal type).</w:t>
+              <w:t>CV Major Contributions. Enter manually (non-journal type). Cite the pull request, not a version: a separate session confirmed on 27 Oct 2026 that no tagged Keras release contains it yet (latest v3.15.1, 29 July 2026; master carries version 3.16.0) and no keras.io page exists. Re-check for a v3.16 tag before certifying.</w:t>
             </w:r>
           </w:p>
           <w:p>
@@ -6514,26 +6396,7 @@
                 <w:i w:val="0"/>
                 <w:sz w:val="22"/>
               </w:rPr>
-              <w:t xml:space="preserve">First tagged Keras release that ships it: </w:t>
-            </w:r>
-            <w:r>
-              <w:rPr>
-                <w:rFonts w:ascii="Times New Roman" w:hAnsi="Times New Roman" w:eastAsia="Times New Roman" w:cs="Times New Roman"/>
-                <w:b/>
-                <w:i w:val="0"/>
-                <w:sz w:val="22"/>
-                <w:highlight w:val="yellow"/>
-              </w:rPr>
-              <w:t>[CONFIRM]</w:t>
-            </w:r>
-            <w:r>
-              <w:rPr>
-                <w:rFonts w:ascii="Times New Roman" w:hAnsi="Times New Roman" w:eastAsia="Times New Roman" w:cs="Times New Roman"/>
-                <w:b w:val="0"/>
-                <w:i w:val="0"/>
-                <w:sz w:val="22"/>
-              </w:rPr>
-              <w:t xml:space="preserve"> (release notes through v3.15.1 of 29 July 2026 do not name it). Add the keras.io API page URL once it is live, if Brian prefers a docs link to the PR.</w:t>
+              <w:t>The ReconstructPatches2D/3D layers named in the CV and in the pull-request title were removed before merge and are not in Keras; the CV entry needs correcting (separate task). PR #23930 (overlapping patches) is still open and must not be described as merged.</w:t>
             </w:r>
           </w:p>
         </w:tc>
@@ -7512,7 +7375,23 @@
           <w:i w:val="0"/>
           <w:sz w:val="28"/>
         </w:rPr>
-        <w:t>6. Open items for Brian</w:t>
+        <w:t>6. Decisions and open items</w:t>
+      </w:r>
+    </w:p>
+    <w:p>
+      <w:pPr>
+        <w:pStyle w:val="Heading2"/>
+        <w:keepNext/>
+        <w:spacing w:before="200" w:after="80"/>
+      </w:pPr>
+      <w:r>
+        <w:rPr>
+          <w:rFonts w:ascii="Times New Roman" w:hAnsi="Times New Roman" w:eastAsia="Times New Roman" w:cs="Times New Roman"/>
+          <w:b/>
+          <w:i w:val="0"/>
+          <w:sz w:val="24"/>
+        </w:rPr>
+        <w:t>6a. Decided by Brian (27 Oct 2026)</w:t>
       </w:r>
     </w:p>
     <w:p>
@@ -7527,7 +7406,7 @@
           <w:i w:val="0"/>
           <w:sz w:val="22"/>
         </w:rPr>
-        <w:t>Position title wording (Clinical Assistant Professor of Medical Physics vs. Assistant Professor, Medical Physics). Use the same wording in all four NSF documents.</w:t>
+        <w:t>Position title: “Assistant Professor of Medical Physics”, used in all four NSF documents.</w:t>
       </w:r>
     </w:p>
     <w:p>
@@ -7542,7 +7421,7 @@
           <w:i w:val="0"/>
           <w:sz w:val="22"/>
         </w:rPr>
-        <w:t>Completion dates: Ph.D. 05/2021 (NIH biosketch) or 06/2021 (SciENcv 02/2026); Residency 07/2023 (NIH) or 06/2023 (SciENcv). Check the diploma / residency certificate.</w:t>
+        <w:t>Ph.D. completion 05/2021; field of study “Medical Physics” for both the S.M.S. and the Ph.D. The SciENcv profile from 02/2026 shows 06/2021 for the Ph.D. and must be corrected when the new document is built.</w:t>
       </w:r>
     </w:p>
     <w:p>
@@ -7557,7 +7436,7 @@
           <w:i w:val="0"/>
           <w:sz w:val="22"/>
         </w:rPr>
-        <w:t>Field of study for the S.M.S. and Ph.D.: plain “Medical Physics” (SciENcv 02/2026) or the NIH biosketch’s “Therapeutic” / “Diagnostic Imaging Medical Physics”.</w:t>
+        <w:t>Department names in section 3a and the AAPM location for the Associate Editor entry are correct as written.</w:t>
       </w:r>
     </w:p>
     <w:p>
@@ -7572,7 +7451,7 @@
           <w:i w:val="0"/>
           <w:sz w:val="22"/>
         </w:rPr>
-        <w:t>Residency entry type in the SciENcv Professional Preparation drop-down (Residency / Other / typed “Resident” as in 02/2026).</w:t>
+        <w:t>AAPM committee memberships (QUANTEC 2 Working Group, Machine Intelligence Subcommittee, TG-263, Board of Associate Editors) go in Synergistic Activities, not in Appointments.</w:t>
       </w:r>
     </w:p>
     <w:p>
@@ -7587,7 +7466,7 @@
           <w:i w:val="0"/>
           <w:sz w:val="22"/>
         </w:rPr>
-        <w:t>Department names flagged in section 3: UNC adjunct appointment, MD Anderson graduate research, St. Joseph Hospital fellowship, Georgia Tech research assistantship; and a city/state for the Medical Physics Associate Editor entry.</w:t>
+        <w:t>TG-263 membership end date is “Present”; the CV’s Major Contributions entry (2021–2025) is being corrected in a separate session.</w:t>
       </w:r>
     </w:p>
     <w:p>
@@ -7602,7 +7481,7 @@
           <w:i w:val="0"/>
           <w:sz w:val="22"/>
         </w:rPr>
-        <w:t>Whether to list Clinical Resident, Chief Resident, Ad hoc Associate Editor, and the AAPM committee memberships as appointments (section 3b). Recommendation: keep the titled roles, leave committee memberships for Synergistic Activities.</w:t>
+        <w:t>Product split in 4a/4b confirmed. The Keras release question was investigated separately: B5 is in no tagged release as of 27 Oct 2026, so the citation points at the merged pull request.</w:t>
       </w:r>
     </w:p>
     <w:p>
@@ -7617,7 +7496,23 @@
           <w:i w:val="0"/>
           <w:sz w:val="22"/>
         </w:rPr>
-        <w:t>TG-263 membership end date: CV Professional Service says 2021 – Present; CV Major Contributions says 2021–2025.</w:t>
+        <w:t>ORCID gap acknowledged: A2, A5, B3, B5 (and C6, C7, C8 if used) will not import; they are entered manually in SciENcv or pushed to ORCID first.</w:t>
+      </w:r>
+    </w:p>
+    <w:p>
+      <w:pPr>
+        <w:pStyle w:val="Heading2"/>
+        <w:keepNext/>
+        <w:spacing w:before="200" w:after="80"/>
+      </w:pPr>
+      <w:r>
+        <w:rPr>
+          <w:rFonts w:ascii="Times New Roman" w:hAnsi="Times New Roman" w:eastAsia="Times New Roman" w:cs="Times New Roman"/>
+          <w:b/>
+          <w:i w:val="0"/>
+          <w:sz w:val="24"/>
+        </w:rPr>
+        <w:t>6b. Still open</w:t>
       </w:r>
     </w:p>
     <w:p>
@@ -7632,7 +7527,17 @@
           <w:i w:val="0"/>
           <w:sz w:val="22"/>
         </w:rPr>
-        <w:t>Products: confirm the proposal topic and the A/B split (section 4). Swap in bench items (4c) as needed; at most five per list.</w:t>
+        <w:t xml:space="preserve">Residency completion month: 06/2023 (SciENcv 02/2026) or 07/2023 (NIH biosketch table). </w:t>
+      </w:r>
+      <w:r>
+        <w:rPr>
+          <w:rFonts w:ascii="Times New Roman" w:hAnsi="Times New Roman" w:eastAsia="Times New Roman" w:cs="Times New Roman"/>
+          <w:b/>
+          <w:i w:val="0"/>
+          <w:sz w:val="22"/>
+          <w:highlight w:val="yellow"/>
+        </w:rPr>
+        <w:t>[CONFIRM]</w:t>
       </w:r>
     </w:p>
     <w:p>
@@ -7647,7 +7552,7 @@
           <w:i w:val="0"/>
           <w:sz w:val="22"/>
         </w:rPr>
-        <w:t>Volume/issue/pages for A5 (Advances in Radiation Oncology 2026) and C7 (Practical Radiation Oncology 2026); first Keras release containing B5.</w:t>
+        <w:t>Whether to add the two optional titled roles in 3b (Chief Resident 2021–2023; Ad hoc Associate Editor 2020–2021) to the Appointments list.</w:t>
       </w:r>
     </w:p>
     <w:p>
@@ -7662,7 +7567,37 @@
           <w:i w:val="0"/>
           <w:sz w:val="22"/>
         </w:rPr>
-        <w:t>ORCID gap: a previous session found Brian’s ORCID record missing works from 2022 onward. A2, A5, B3, B5 (and C6, C7, C8 if used) will not import; enter them manually in SciENcv or add them to ORCID first and re-sync.</w:t>
+        <w:t>Volume/issue/pages for A5 (Advances in Radiation Oncology 2026) and C7 (Practical Radiation Oncology 2026): not yet assigned by the journals; check again before certifying.</w:t>
+      </w:r>
+    </w:p>
+    <w:p>
+      <w:pPr>
+        <w:pStyle w:val="ListBullet"/>
+        <w:spacing w:after="60"/>
+      </w:pPr>
+      <w:r>
+        <w:rPr>
+          <w:rFonts w:ascii="Times New Roman" w:hAnsi="Times New Roman" w:eastAsia="Times New Roman" w:cs="Times New Roman"/>
+          <w:b w:val="0"/>
+          <w:i w:val="0"/>
+          <w:sz w:val="22"/>
+        </w:rPr>
+        <w:t>Before certifying, re-check whether a Keras v3.16 tag exists and contains merge commit bbd36de (PR #22984); if so, add the version and date to B5.</w:t>
+      </w:r>
+    </w:p>
+    <w:p>
+      <w:pPr>
+        <w:pStyle w:val="ListBullet"/>
+        <w:spacing w:after="60"/>
+      </w:pPr>
+      <w:r>
+        <w:rPr>
+          <w:rFonts w:ascii="Times New Roman" w:hAnsi="Times New Roman" w:eastAsia="Times New Roman" w:cs="Times New Roman"/>
+          <w:b w:val="0"/>
+          <w:i w:val="0"/>
+          <w:sz w:val="22"/>
+        </w:rPr>
+        <w:t>The CV’s Major Contributions entry credits ReconstructPatches2D/3D layers that were dropped from PR #22984 before merge; only the reconstruct_patches op is in Keras. Correct the CV entry (separate /update-cv task, Brian’s approval).</w:t>
       </w:r>
     </w:p>
     <w:p>
@@ -7692,7 +7627,7 @@
           <w:i w:val="0"/>
           <w:sz w:val="22"/>
         </w:rPr>
-        <w:t>CV discrepancies noticed while verifying citations (not changed here; separate /update-cv task): Open RT Structures date and author list; DicomRTTool paper title/date; DICOM attribute tool title (SOP vs Study Instance UID); COVER-ALL title and “Shan”/“Shah”; Frontiers journal name; elective-nodes paper author list (Dooley J); book chapter title, publisher (IOP) and date (11/2025).</w:t>
+        <w:t>CV citation discrepancies found while verifying DOIs are being corrected in a separate session; they do not affect the citations in section 4, which already use the published records.</w:t>
       </w:r>
     </w:p>
     <w:sectPr>

</xml_diff>